<commit_message>
Logbook fits on one page
</commit_message>
<xml_diff>
--- a/report/Weekly_Progress_Logbook.docx
+++ b/report/Weekly_Progress_Logbook.docx
@@ -10,7 +10,7 @@
       <w:r>
         <w:drawing>
           <wp:inline xmlns:a="http://schemas.openxmlformats.org/drawingml/2006/main" xmlns:pic="http://schemas.openxmlformats.org/drawingml/2006/picture">
-            <wp:extent cx="685800" cy="681288"/>
+            <wp:extent cx="548640" cy="545031"/>
             <wp:docPr id="1" name="Picture 1"/>
             <wp:cNvGraphicFramePr>
               <a:graphicFrameLocks noChangeAspect="1"/>
@@ -31,7 +31,7 @@
                   <pic:spPr>
                     <a:xfrm>
                       <a:off x="0" y="0"/>
-                      <a:ext cx="685800" cy="681288"/>
+                      <a:ext cx="548640" cy="545031"/>
                     </a:xfrm>
                     <a:prstGeom prst="rect"/>
                   </pic:spPr>
@@ -44,7 +44,7 @@
     </w:p>
     <w:p>
       <w:pPr>
-        <w:spacing w:after="20" w:before="0"/>
+        <w:spacing w:after="0" w:before="0"/>
         <w:jc w:val="center"/>
       </w:pPr>
       <w:r>
@@ -53,7 +53,7 @@
           <w:b/>
           <w:i w:val="0"/>
           <w:color w:val="1F2A5E"/>
-          <w:sz w:val="28"/>
+          <w:sz w:val="26"/>
         </w:rPr>
         <w:t>LLOYD INSTITUTE OF MANAGEMENT AND TECHNOLOGY</w:t>
       </w:r>
@@ -75,7 +75,7 @@
     </w:p>
     <w:p>
       <w:pPr>
-        <w:spacing w:after="120" w:before="0"/>
+        <w:spacing w:after="60" w:before="0"/>
         <w:jc w:val="center"/>
       </w:pPr>
       <w:r>
@@ -90,7 +90,7 @@
     </w:p>
     <w:p>
       <w:pPr>
-        <w:spacing w:after="80" w:before="0"/>
+        <w:spacing w:after="40" w:before="0"/>
         <w:jc w:val="center"/>
       </w:pPr>
       <w:r>
@@ -99,14 +99,14 @@
           <w:b/>
           <w:i w:val="0"/>
           <w:color w:val="1F2A5E"/>
-          <w:sz w:val="22"/>
+          <w:sz w:val="21"/>
         </w:rPr>
         <w:t>DEPARTMENT OF COMPUTER SCIENCE &amp; ENGINEERING &amp; ALLIED BRANCHES</w:t>
       </w:r>
     </w:p>
     <w:p>
       <w:pPr>
-        <w:spacing w:after="120" w:before="0"/>
+        <w:spacing w:after="60" w:before="0"/>
         <w:jc w:val="center"/>
       </w:pPr>
       <w:r>
@@ -114,7 +114,7 @@
           <w:rFonts w:ascii="Times New Roman" w:hAnsi="Times New Roman"/>
           <w:b/>
           <w:i w:val="0"/>
-          <w:sz w:val="24"/>
+          <w:sz w:val="22"/>
         </w:rPr>
         <w:t>MINI PROJECT (BCC351 / BCS554 / BCS752)</w:t>
       </w:r>
@@ -130,14 +130,14 @@
           <w:b/>
           <w:i w:val="0"/>
           <w:color w:val="1F2A5E"/>
-          <w:sz w:val="26"/>
+          <w:sz w:val="24"/>
         </w:rPr>
         <w:t>Weekly Progress Log</w:t>
       </w:r>
     </w:p>
     <w:p>
       <w:pPr>
-        <w:spacing w:after="160" w:before="0"/>
+        <w:spacing w:after="60" w:before="0"/>
         <w:jc w:val="left"/>
       </w:pPr>
       <w:r>
@@ -197,7 +197,7 @@
     </w:p>
     <w:p>
       <w:pPr>
-        <w:spacing w:after="200" w:before="0"/>
+        <w:spacing w:after="60" w:before="0"/>
         <w:jc w:val="left"/>
       </w:pPr>
       <w:r>
@@ -221,7 +221,7 @@
     </w:p>
     <w:p>
       <w:pPr>
-        <w:spacing w:after="200" w:before="0"/>
+        <w:spacing w:after="120" w:before="0"/>
         <w:jc w:val="left"/>
       </w:pPr>
       <w:r>
@@ -251,14 +251,14 @@
         <w:tblLook w:firstColumn="1" w:firstRow="1" w:lastColumn="0" w:lastRow="0" w:noHBand="0" w:noVBand="1" w:val="04A0"/>
       </w:tblPr>
       <w:tblGrid>
-        <w:gridCol w:w="3010"/>
-        <w:gridCol w:w="3010"/>
-        <w:gridCol w:w="3010"/>
+        <w:gridCol w:w="3202"/>
+        <w:gridCol w:w="3202"/>
+        <w:gridCol w:w="3202"/>
       </w:tblGrid>
       <w:tr>
         <w:tc>
           <w:tcPr>
-            <w:tcW w:type="dxa" w:w="2016"/>
+            <w:tcW w:type="dxa" w:w="1656"/>
             <w:shd w:val="clear" w:color="auto" w:fill="D9E2F3"/>
           </w:tcPr>
           <w:p>
@@ -279,7 +279,7 @@
         </w:tc>
         <w:tc>
           <w:tcPr>
-            <w:tcW w:type="dxa" w:w="5616"/>
+            <w:tcW w:type="dxa" w:w="6408"/>
             <w:shd w:val="clear" w:color="auto" w:fill="D9E2F3"/>
           </w:tcPr>
           <w:p>
@@ -300,7 +300,7 @@
         </w:tc>
         <w:tc>
           <w:tcPr>
-            <w:tcW w:type="dxa" w:w="2016"/>
+            <w:tcW w:type="dxa" w:w="1512"/>
             <w:shd w:val="clear" w:color="auto" w:fill="D9E2F3"/>
           </w:tcPr>
           <w:p>
@@ -323,7 +323,7 @@
       <w:tr>
         <w:tc>
           <w:tcPr>
-            <w:tcW w:type="dxa" w:w="2016"/>
+            <w:tcW w:type="dxa" w:w="1656"/>
             <w:vAlign w:val="center"/>
           </w:tcPr>
           <w:p>
@@ -335,7 +335,7 @@
                 <w:rFonts w:ascii="Times New Roman" w:hAnsi="Times New Roman"/>
                 <w:b w:val="0"/>
                 <w:i w:val="0"/>
-                <w:sz w:val="20"/>
+                <w:sz w:val="18"/>
               </w:rPr>
               <w:t>08–13 Sep 2026</w:t>
             </w:r>
@@ -343,12 +343,12 @@
         </w:tc>
         <w:tc>
           <w:tcPr>
-            <w:tcW w:type="dxa" w:w="5616"/>
+            <w:tcW w:type="dxa" w:w="6408"/>
             <w:vAlign w:val="center"/>
           </w:tcPr>
           <w:p>
             <w:pPr>
-              <w:spacing w:after="60" w:before="60"/>
+              <w:spacing w:after="20" w:before="20"/>
               <w:jc w:val="left"/>
             </w:pPr>
             <w:r>
@@ -356,7 +356,7 @@
                 <w:rFonts w:ascii="Times New Roman" w:hAnsi="Times New Roman"/>
                 <w:b w:val="0"/>
                 <w:i w:val="0"/>
-                <w:sz w:val="20"/>
+                <w:sz w:val="18"/>
               </w:rPr>
               <w:t>Studied the mini project guidelines and the cyber-security domain. Selected the topic: a real-time network intrusion detection system. Learned what an IDS is and how it differs from a firewall.</w:t>
             </w:r>
@@ -364,7 +364,7 @@
         </w:tc>
         <w:tc>
           <w:tcPr>
-            <w:tcW w:type="dxa" w:w="2016"/>
+            <w:tcW w:type="dxa" w:w="1512"/>
             <w:vAlign w:val="center"/>
           </w:tcPr>
           <w:p/>
@@ -373,7 +373,7 @@
       <w:tr>
         <w:tc>
           <w:tcPr>
-            <w:tcW w:type="dxa" w:w="2016"/>
+            <w:tcW w:type="dxa" w:w="1656"/>
             <w:vAlign w:val="center"/>
           </w:tcPr>
           <w:p>
@@ -385,7 +385,7 @@
                 <w:rFonts w:ascii="Times New Roman" w:hAnsi="Times New Roman"/>
                 <w:b w:val="0"/>
                 <w:i w:val="0"/>
-                <w:sz w:val="20"/>
+                <w:sz w:val="18"/>
               </w:rPr>
               <w:t>15–20 Sep 2026</w:t>
             </w:r>
@@ -393,12 +393,12 @@
         </w:tc>
         <w:tc>
           <w:tcPr>
-            <w:tcW w:type="dxa" w:w="5616"/>
+            <w:tcW w:type="dxa" w:w="6408"/>
             <w:vAlign w:val="center"/>
           </w:tcPr>
           <w:p>
             <w:pPr>
-              <w:spacing w:after="60" w:before="60"/>
+              <w:spacing w:after="20" w:before="20"/>
               <w:jc w:val="left"/>
             </w:pPr>
             <w:r>
@@ -406,7 +406,7 @@
                 <w:rFonts w:ascii="Times New Roman" w:hAnsi="Times New Roman"/>
                 <w:b w:val="0"/>
                 <w:i w:val="0"/>
-                <w:sz w:val="20"/>
+                <w:sz w:val="18"/>
               </w:rPr>
               <w:t>Carried out the literature survey of Wireshark, Snort, Zeek and Scapy, and of the port-scan, SYN-flood and ARP-spoofing attacks. Prepared and submitted the project synopsis.</w:t>
             </w:r>
@@ -414,7 +414,7 @@
         </w:tc>
         <w:tc>
           <w:tcPr>
-            <w:tcW w:type="dxa" w:w="2016"/>
+            <w:tcW w:type="dxa" w:w="1512"/>
             <w:vAlign w:val="center"/>
           </w:tcPr>
           <w:p/>
@@ -423,7 +423,7 @@
       <w:tr>
         <w:tc>
           <w:tcPr>
-            <w:tcW w:type="dxa" w:w="2016"/>
+            <w:tcW w:type="dxa" w:w="1656"/>
             <w:vAlign w:val="center"/>
           </w:tcPr>
           <w:p>
@@ -435,7 +435,7 @@
                 <w:rFonts w:ascii="Times New Roman" w:hAnsi="Times New Roman"/>
                 <w:b w:val="0"/>
                 <w:i w:val="0"/>
-                <w:sz w:val="20"/>
+                <w:sz w:val="18"/>
               </w:rPr>
               <w:t>22–27 Sep 2026</w:t>
             </w:r>
@@ -443,12 +443,12 @@
         </w:tc>
         <w:tc>
           <w:tcPr>
-            <w:tcW w:type="dxa" w:w="5616"/>
+            <w:tcW w:type="dxa" w:w="6408"/>
             <w:vAlign w:val="center"/>
           </w:tcPr>
           <w:p>
             <w:pPr>
-              <w:spacing w:after="60" w:before="60"/>
+              <w:spacing w:after="20" w:before="20"/>
               <w:jc w:val="left"/>
             </w:pPr>
             <w:r>
@@ -456,7 +456,7 @@
                 <w:rFonts w:ascii="Times New Roman" w:hAnsi="Times New Roman"/>
                 <w:b w:val="0"/>
                 <w:i w:val="0"/>
-                <w:sz w:val="20"/>
+                <w:sz w:val="18"/>
               </w:rPr>
               <w:t>Synopsis approved and title locked. Designed the system architecture and drew the level-0 and level-1 data-flow diagrams and the use-case diagram. Fixed the detection thresholds.</w:t>
             </w:r>
@@ -464,7 +464,7 @@
         </w:tc>
         <w:tc>
           <w:tcPr>
-            <w:tcW w:type="dxa" w:w="2016"/>
+            <w:tcW w:type="dxa" w:w="1512"/>
             <w:vAlign w:val="center"/>
           </w:tcPr>
           <w:p/>
@@ -473,7 +473,7 @@
       <w:tr>
         <w:tc>
           <w:tcPr>
-            <w:tcW w:type="dxa" w:w="2016"/>
+            <w:tcW w:type="dxa" w:w="1656"/>
             <w:vAlign w:val="center"/>
           </w:tcPr>
           <w:p>
@@ -485,7 +485,7 @@
                 <w:rFonts w:ascii="Times New Roman" w:hAnsi="Times New Roman"/>
                 <w:b w:val="0"/>
                 <w:i w:val="0"/>
-                <w:sz w:val="20"/>
+                <w:sz w:val="18"/>
               </w:rPr>
               <w:t>29 Sep–04 Oct 2026</w:t>
             </w:r>
@@ -493,12 +493,12 @@
         </w:tc>
         <w:tc>
           <w:tcPr>
-            <w:tcW w:type="dxa" w:w="5616"/>
+            <w:tcW w:type="dxa" w:w="6408"/>
             <w:vAlign w:val="center"/>
           </w:tcPr>
           <w:p>
             <w:pPr>
-              <w:spacing w:after="60" w:before="60"/>
+              <w:spacing w:after="20" w:before="20"/>
               <w:jc w:val="left"/>
             </w:pPr>
             <w:r>
@@ -506,7 +506,7 @@
                 <w:rFonts w:ascii="Times New Roman" w:hAnsi="Times New Roman"/>
                 <w:b w:val="0"/>
                 <w:i w:val="0"/>
-                <w:sz w:val="20"/>
+                <w:sz w:val="18"/>
               </w:rPr>
               <w:t>Set up the development environment: installed Npcap, Python with Scapy, Node.js, Express and Socket.IO. Verified live packet capture. Issue: Windows capture needs Npcap and the correct interface.</w:t>
             </w:r>
@@ -514,7 +514,7 @@
         </w:tc>
         <w:tc>
           <w:tcPr>
-            <w:tcW w:type="dxa" w:w="2016"/>
+            <w:tcW w:type="dxa" w:w="1512"/>
             <w:vAlign w:val="center"/>
           </w:tcPr>
           <w:p/>
@@ -523,7 +523,7 @@
       <w:tr>
         <w:tc>
           <w:tcPr>
-            <w:tcW w:type="dxa" w:w="2016"/>
+            <w:tcW w:type="dxa" w:w="1656"/>
             <w:vAlign w:val="center"/>
           </w:tcPr>
           <w:p>
@@ -535,7 +535,7 @@
                 <w:rFonts w:ascii="Times New Roman" w:hAnsi="Times New Roman"/>
                 <w:b w:val="0"/>
                 <w:i w:val="0"/>
-                <w:sz w:val="20"/>
+                <w:sz w:val="18"/>
               </w:rPr>
               <w:t>06–10 Oct 2026</w:t>
             </w:r>
@@ -543,12 +543,12 @@
         </w:tc>
         <w:tc>
           <w:tcPr>
-            <w:tcW w:type="dxa" w:w="5616"/>
+            <w:tcW w:type="dxa" w:w="6408"/>
             <w:vAlign w:val="center"/>
           </w:tcPr>
           <w:p>
             <w:pPr>
-              <w:spacing w:after="60" w:before="60"/>
+              <w:spacing w:after="20" w:before="20"/>
               <w:jc w:val="left"/>
             </w:pPr>
             <w:r>
@@ -556,7 +556,7 @@
                 <w:rFonts w:ascii="Times New Roman" w:hAnsi="Times New Roman"/>
                 <w:b w:val="0"/>
                 <w:i w:val="0"/>
-                <w:sz w:val="20"/>
+                <w:sz w:val="18"/>
               </w:rPr>
               <w:t>Implemented packet capture with a filter and per-second TCP/UDP/ARP counts, and the port-scan rule with a sliding window and cool-down. First evaluation: live counts and a port-scan alert on the dashboard.</w:t>
             </w:r>
@@ -564,7 +564,7 @@
         </w:tc>
         <w:tc>
           <w:tcPr>
-            <w:tcW w:type="dxa" w:w="2016"/>
+            <w:tcW w:type="dxa" w:w="1512"/>
             <w:vAlign w:val="center"/>
           </w:tcPr>
           <w:p/>
@@ -573,7 +573,7 @@
       <w:tr>
         <w:tc>
           <w:tcPr>
-            <w:tcW w:type="dxa" w:w="2016"/>
+            <w:tcW w:type="dxa" w:w="1656"/>
             <w:vAlign w:val="center"/>
           </w:tcPr>
           <w:p>
@@ -585,7 +585,7 @@
                 <w:rFonts w:ascii="Times New Roman" w:hAnsi="Times New Roman"/>
                 <w:b w:val="0"/>
                 <w:i w:val="0"/>
-                <w:sz w:val="20"/>
+                <w:sz w:val="18"/>
               </w:rPr>
               <w:t>13–18 Oct 2026</w:t>
             </w:r>
@@ -593,12 +593,12 @@
         </w:tc>
         <w:tc>
           <w:tcPr>
-            <w:tcW w:type="dxa" w:w="5616"/>
+            <w:tcW w:type="dxa" w:w="6408"/>
             <w:vAlign w:val="center"/>
           </w:tcPr>
           <w:p>
             <w:pPr>
-              <w:spacing w:after="60" w:before="60"/>
+              <w:spacing w:after="20" w:before="20"/>
               <w:jc w:val="left"/>
             </w:pPr>
             <w:r>
@@ -606,7 +606,7 @@
                 <w:rFonts w:ascii="Times New Roman" w:hAnsi="Times New Roman"/>
                 <w:b w:val="0"/>
                 <w:i w:val="0"/>
-                <w:sz w:val="20"/>
+                <w:sz w:val="18"/>
               </w:rPr>
               <w:t>Built the Node.js and Express server to receive, validate and log alerts, and the live dashboard with a chart, alert table and colour-coded banner over Socket.IO. Added alert history that survives a page reload.</w:t>
             </w:r>
@@ -614,7 +614,7 @@
         </w:tc>
         <w:tc>
           <w:tcPr>
-            <w:tcW w:type="dxa" w:w="2016"/>
+            <w:tcW w:type="dxa" w:w="1512"/>
             <w:vAlign w:val="center"/>
           </w:tcPr>
           <w:p/>
@@ -623,7 +623,7 @@
       <w:tr>
         <w:tc>
           <w:tcPr>
-            <w:tcW w:type="dxa" w:w="2016"/>
+            <w:tcW w:type="dxa" w:w="1656"/>
             <w:vAlign w:val="center"/>
           </w:tcPr>
           <w:p>
@@ -635,7 +635,7 @@
                 <w:rFonts w:ascii="Times New Roman" w:hAnsi="Times New Roman"/>
                 <w:b w:val="0"/>
                 <w:i w:val="0"/>
-                <w:sz w:val="20"/>
+                <w:sz w:val="18"/>
               </w:rPr>
               <w:t>20–25 Oct 2026</w:t>
             </w:r>
@@ -643,12 +643,12 @@
         </w:tc>
         <w:tc>
           <w:tcPr>
-            <w:tcW w:type="dxa" w:w="5616"/>
+            <w:tcW w:type="dxa" w:w="6408"/>
             <w:vAlign w:val="center"/>
           </w:tcPr>
           <w:p>
             <w:pPr>
-              <w:spacing w:after="60" w:before="60"/>
+              <w:spacing w:after="20" w:before="20"/>
               <w:jc w:val="left"/>
             </w:pPr>
             <w:r>
@@ -656,7 +656,7 @@
                 <w:rFonts w:ascii="Times New Roman" w:hAnsi="Times New Roman"/>
                 <w:b w:val="0"/>
                 <w:i w:val="0"/>
-                <w:sz w:val="20"/>
+                <w:sz w:val="18"/>
               </w:rPr>
               <w:t>Implemented the SYN-flood rule (half-open handshake counting) and the ARP-spoofing rule (gateway trust table). Wrote ten automated unit tests covering all three rules with positive and negative cases; all pass.</w:t>
             </w:r>
@@ -664,7 +664,7 @@
         </w:tc>
         <w:tc>
           <w:tcPr>
-            <w:tcW w:type="dxa" w:w="2016"/>
+            <w:tcW w:type="dxa" w:w="1512"/>
             <w:vAlign w:val="center"/>
           </w:tcPr>
           <w:p/>
@@ -673,7 +673,7 @@
       <w:tr>
         <w:tc>
           <w:tcPr>
-            <w:tcW w:type="dxa" w:w="2016"/>
+            <w:tcW w:type="dxa" w:w="1656"/>
             <w:vAlign w:val="center"/>
           </w:tcPr>
           <w:p>
@@ -685,7 +685,7 @@
                 <w:rFonts w:ascii="Times New Roman" w:hAnsi="Times New Roman"/>
                 <w:b w:val="0"/>
                 <w:i w:val="0"/>
-                <w:sz w:val="20"/>
+                <w:sz w:val="18"/>
               </w:rPr>
               <w:t>27–28 Oct 2026</w:t>
             </w:r>
@@ -693,12 +693,12 @@
         </w:tc>
         <w:tc>
           <w:tcPr>
-            <w:tcW w:type="dxa" w:w="5616"/>
+            <w:tcW w:type="dxa" w:w="6408"/>
             <w:vAlign w:val="center"/>
           </w:tcPr>
           <w:p>
             <w:pPr>
-              <w:spacing w:after="60" w:before="60"/>
+              <w:spacing w:after="20" w:before="20"/>
               <w:jc w:val="left"/>
             </w:pPr>
             <w:r>
@@ -706,7 +706,7 @@
                 <w:rFonts w:ascii="Times New Roman" w:hAnsi="Times New Roman"/>
                 <w:b w:val="0"/>
                 <w:i w:val="0"/>
-                <w:sz w:val="20"/>
+                <w:sz w:val="18"/>
               </w:rPr>
               <w:t>Integration testing with self-generated attacks on an isolated host; measured detection latency and false alarms. Completed the sequence, component and deployment diagrams.</w:t>
             </w:r>
@@ -714,7 +714,7 @@
         </w:tc>
         <w:tc>
           <w:tcPr>
-            <w:tcW w:type="dxa" w:w="2016"/>
+            <w:tcW w:type="dxa" w:w="1512"/>
             <w:vAlign w:val="center"/>
           </w:tcPr>
           <w:p/>
@@ -723,7 +723,7 @@
       <w:tr>
         <w:tc>
           <w:tcPr>
-            <w:tcW w:type="dxa" w:w="2016"/>
+            <w:tcW w:type="dxa" w:w="1656"/>
             <w:vAlign w:val="center"/>
           </w:tcPr>
           <w:p>
@@ -735,7 +735,7 @@
                 <w:rFonts w:ascii="Times New Roman" w:hAnsi="Times New Roman"/>
                 <w:b w:val="0"/>
                 <w:i w:val="0"/>
-                <w:sz w:val="20"/>
+                <w:sz w:val="18"/>
               </w:rPr>
               <w:t>29–30 Oct 2026</w:t>
             </w:r>
@@ -743,12 +743,12 @@
         </w:tc>
         <w:tc>
           <w:tcPr>
-            <w:tcW w:type="dxa" w:w="5616"/>
+            <w:tcW w:type="dxa" w:w="6408"/>
             <w:vAlign w:val="center"/>
           </w:tcPr>
           <w:p>
             <w:pPr>
-              <w:spacing w:after="60" w:before="60"/>
+              <w:spacing w:after="20" w:before="20"/>
               <w:jc w:val="left"/>
             </w:pPr>
             <w:r>
@@ -756,7 +756,7 @@
                 <w:rFonts w:ascii="Times New Roman" w:hAnsi="Times New Roman"/>
                 <w:b w:val="0"/>
                 <w:i w:val="0"/>
-                <w:sz w:val="20"/>
+                <w:sz w:val="18"/>
               </w:rPr>
               <w:t>Wrote and formatted the full project report, ran the plagiarism check, and prepared the presentation. Pushed the source code to GitHub. Final evaluation and viva-voce.</w:t>
             </w:r>
@@ -764,65 +764,16 @@
         </w:tc>
         <w:tc>
           <w:tcPr>
-            <w:tcW w:type="dxa" w:w="2016"/>
-            <w:vAlign w:val="center"/>
-          </w:tcPr>
-          <w:p/>
-        </w:tc>
-      </w:tr>
-      <w:tr>
-        <w:tc>
-          <w:tcPr>
-            <w:tcW w:type="dxa" w:w="2016"/>
-            <w:vAlign w:val="center"/>
-          </w:tcPr>
-          <w:p>
-            <w:pPr>
-              <w:jc w:val="center"/>
-            </w:pPr>
-            <w:r>
-              <w:rPr>
-                <w:rFonts w:ascii="Times New Roman" w:hAnsi="Times New Roman"/>
-                <w:b w:val="0"/>
-                <w:i w:val="0"/>
-                <w:sz w:val="20"/>
-              </w:rPr>
-            </w:r>
-          </w:p>
-        </w:tc>
-        <w:tc>
-          <w:tcPr>
-            <w:tcW w:type="dxa" w:w="5616"/>
-            <w:vAlign w:val="center"/>
-          </w:tcPr>
-          <w:p>
-            <w:pPr>
-              <w:spacing w:after="60" w:before="60"/>
-              <w:jc w:val="left"/>
-            </w:pPr>
-            <w:r>
-              <w:rPr>
-                <w:rFonts w:ascii="Times New Roman" w:hAnsi="Times New Roman"/>
-                <w:b w:val="0"/>
-                <w:i w:val="0"/>
-                <w:sz w:val="20"/>
-              </w:rPr>
-            </w:r>
-          </w:p>
-        </w:tc>
-        <w:tc>
-          <w:tcPr>
-            <w:tcW w:type="dxa" w:w="2016"/>
+            <w:tcW w:type="dxa" w:w="1512"/>
             <w:vAlign w:val="center"/>
           </w:tcPr>
           <w:p/>
         </w:tc>
       </w:tr>
     </w:tbl>
-    <w:p/>
     <w:p>
       <w:pPr>
-        <w:spacing w:before="480"/>
+        <w:spacing w:before="280"/>
         <w:jc w:val="left"/>
       </w:pPr>
       <w:r>
@@ -855,7 +806,7 @@
     </w:p>
     <w:sectPr>
       <w:pgSz w:w="11909" w:h="16834"/>
-      <w:pgMar w:top="1152" w:right="1440" w:bottom="1152" w:left="1440" w:header="720" w:footer="720" w:gutter="0"/>
+      <w:pgMar w:top="720" w:right="1152" w:bottom="720" w:left="1152" w:header="720" w:footer="720" w:gutter="0"/>
       <w:cols w:space="720"/>
       <w:docGrid w:linePitch="360"/>
     </w:sectPr>

</xml_diff>